<commit_message>
Document Harness Readiness in BRD (1.6) and PRD (1.8)
BRD: new revision-history row + a new Section 8.2 bullet describing the
feature as the first step of the harness-engineering direction — a
structurally distinct 4th mode (self-audits a team's own agent-dev
process, not a stack recommendation).

PRD: new revision-history row + new Section 7.9 "Harness Readiness
(self-audit mode)" with FR-45 through FR-49 (mode card, guided 5-question
scoring, fix-priority list w/ empty-state handling, no-vendor-names
policy for guardrails/observability, in-product rubric attribution), plus
a v2.5 Release Plan row.

DDD untouched — this feature is 100% client-side with no new backend
aggregates/persistence, matching ddd_gen.js's own stated v1 scope.

Regenerated .docx outputs, spot-checked via document.xml extraction to
confirm the new content actually made it into the binaries (not a no-op
regen — both file sizes changed meaningfully).

Co-Authored-By: Claude Sonnet 5 <noreply@anthropic.com>
</commit_message>
<xml_diff>
--- a/docs/AI-Stack-Advisor-BRD.docx
+++ b/docs/AI-Stack-Advisor-BRD.docx
@@ -72,7 +72,7 @@
           <w:sz w:val="20"/>
           <w:szCs w:val="20"/>
         </w:rPr>
-        <w:t xml:space="preserve">1.5</w:t>
+        <w:t xml:space="preserve">1.6</w:t>
       </w:r>
     </w:p>
     <w:p>
@@ -144,7 +144,7 @@
           <w:sz w:val="20"/>
           <w:szCs w:val="20"/>
         </w:rPr>
-        <w:t xml:space="preserve">August 30, 2026</w:t>
+        <w:t xml:space="preserve">August 31, 2026</w:t>
       </w:r>
     </w:p>
     <w:p>
@@ -1242,6 +1242,116 @@
           </w:p>
         </w:tc>
       </w:tr>
+      <w:tr>
+        <w:tc>
+          <w:tcPr>
+            <w:tcW w:type="dxa" w:w="1400"/>
+            <w:tcMar>
+              <w:top w:type="dxa" w:w="80"/>
+              <w:left w:type="dxa" w:w="100"/>
+              <w:bottom w:type="dxa" w:w="80"/>
+              <w:right w:type="dxa" w:w="100"/>
+            </w:tcMar>
+            <w:vAlign w:val="center"/>
+          </w:tcPr>
+          <w:p>
+            <w:pPr>
+              <w:jc w:val="left"/>
+            </w:pPr>
+            <w:r>
+              <w:rPr>
+                <w:b w:val="false"/>
+                <w:bCs w:val="false"/>
+                <w:color w:val="000000"/>
+                <w:sz w:val="19"/>
+                <w:szCs w:val="19"/>
+              </w:rPr>
+              <w:t xml:space="preserve">1.6</w:t>
+            </w:r>
+          </w:p>
+        </w:tc>
+        <w:tc>
+          <w:tcPr>
+            <w:tcW w:type="dxa" w:w="1800"/>
+            <w:tcMar>
+              <w:top w:type="dxa" w:w="80"/>
+              <w:left w:type="dxa" w:w="100"/>
+              <w:bottom w:type="dxa" w:w="80"/>
+              <w:right w:type="dxa" w:w="100"/>
+            </w:tcMar>
+            <w:vAlign w:val="center"/>
+          </w:tcPr>
+          <w:p>
+            <w:pPr>
+              <w:jc w:val="left"/>
+            </w:pPr>
+            <w:r>
+              <w:rPr>
+                <w:b w:val="false"/>
+                <w:bCs w:val="false"/>
+                <w:color w:val="000000"/>
+                <w:sz w:val="19"/>
+                <w:szCs w:val="19"/>
+              </w:rPr>
+              <w:t xml:space="preserve">Later session</w:t>
+            </w:r>
+          </w:p>
+        </w:tc>
+        <w:tc>
+          <w:tcPr>
+            <w:tcW w:type="dxa" w:w="2400"/>
+            <w:tcMar>
+              <w:top w:type="dxa" w:w="80"/>
+              <w:left w:type="dxa" w:w="100"/>
+              <w:bottom w:type="dxa" w:w="80"/>
+              <w:right w:type="dxa" w:w="100"/>
+            </w:tcMar>
+            <w:vAlign w:val="center"/>
+          </w:tcPr>
+          <w:p>
+            <w:pPr>
+              <w:jc w:val="left"/>
+            </w:pPr>
+            <w:r>
+              <w:rPr>
+                <w:b w:val="false"/>
+                <w:bCs w:val="false"/>
+                <w:color w:val="000000"/>
+                <w:sz w:val="19"/>
+                <w:szCs w:val="19"/>
+              </w:rPr>
+              <w:t xml:space="preserve">Muneeb / Claude</w:t>
+            </w:r>
+          </w:p>
+        </w:tc>
+        <w:tc>
+          <w:tcPr>
+            <w:tcW w:type="dxa" w:w="4400"/>
+            <w:tcMar>
+              <w:top w:type="dxa" w:w="80"/>
+              <w:left w:type="dxa" w:w="100"/>
+              <w:bottom w:type="dxa" w:w="80"/>
+              <w:right w:type="dxa" w:w="100"/>
+            </w:tcMar>
+            <w:vAlign w:val="center"/>
+          </w:tcPr>
+          <w:p>
+            <w:pPr>
+              <w:jc w:val="left"/>
+            </w:pPr>
+            <w:r>
+              <w:rPr>
+                <w:b w:val="false"/>
+                <w:bCs w:val="false"/>
+                <w:color w:val="000000"/>
+                <w:sz w:val="19"/>
+                <w:szCs w:val="19"/>
+              </w:rPr>
+              <w:t xml:space="preserve">Documented Harness Readiness in Section 8.2 — a fourth entry mode, distinct from the other three: instead of recommending a technology stack, it scores a team's own agent-development practices (system of record, tools, verification, guardrails, observability) via a guided 5-question self-audit, grounded in a third-party practitioner rubric (cited in-product), and outputs a score, band, and fix-priority list. Deliberately names no vendor for guardrails/observability, per market research finding that vendor category consolidated into security-platform acquisitions in 2026. Client-side only, no marginal cost, no new BR — this is the first exploratory step into a new "help teams build their own harness" direction rather than a change to the existing stack-recommendation product.</w:t>
+            </w:r>
+          </w:p>
+        </w:tc>
+      </w:tr>
     </w:tbl>
     <w:p>
       <w:pPr>
@@ -4650,6 +4760,32 @@
           <w:szCs w:val="21"/>
         </w:rPr>
         <w:t xml:space="preserve">a widget on every stack card letting a user name a preferred alternative and explain why, reusing the same per-category vendor data already shown in each card's "See N alternatives" disclosure. Always captured to localStorage; additionally synced to a new backend record when the current analysis has already been persisted server-side. First real instrumentation for the BRD Section 7 "disagreement rate" metric.</w:t>
+      </w:r>
+    </w:p>
+    <w:p>
+      <w:pPr>
+        <w:pStyle w:val="ListParagraph"/>
+        <w:numPr>
+          <w:ilvl w:val="0"/>
+          <w:numId w:val="2"/>
+        </w:numPr>
+        <w:spacing w:after="90" w:line="264"/>
+      </w:pPr>
+      <w:r>
+        <w:rPr>
+          <w:b/>
+          <w:bCs/>
+          <w:sz w:val="21"/>
+          <w:szCs w:val="21"/>
+        </w:rPr>
+        <w:t xml:space="preserve">Harness Readiness — </w:t>
+      </w:r>
+      <w:r>
+        <w:rPr>
+          <w:sz w:val="21"/>
+          <w:szCs w:val="21"/>
+        </w:rPr>
+        <w:t xml:space="preserve">a fourth entry mode, "Audit your harness," answering a structurally different question than the other three: not what stack to build, but how mature a team's own agent-development process is. A guided 5-question self-audit (system of record, tools, verification, guardrails, observability — one question per component, 4-option radio) produces a /15 score, a maturity band, and a fix-priority list, grounded in a third-party practitioner rubric (Aishwarya Srinivasan / The Gen Academy's Harness Engineering Build Guide, cited on the results screen). Deliberately names no vendor for guardrails or observability fixes — market research behind this feature found that exact vendor category (Lakera, Protect AI, Guardrails AI) got bought out or archived in 2026, so it teaches the underlying practice instead. Client-side only, within the existing BR-5 constraint.</w:t>
       </w:r>
     </w:p>
     <w:p>

</xml_diff>